<commit_message>
Fix pre-site metadata table spacing
</commit_message>
<xml_diff>
--- a/shared/templates/pre-site-visit/phase-ii-pre-site-visit-v1.docx
+++ b/shared/templates/pre-site-visit/phase-ii-pre-site-visit-v1.docx
@@ -102,7 +102,7 @@
         <w:tc>
           <w:tcPr>
             <w:tcW w:w="1000" w:type="pct"/>
-            <w:vAlign w:val="center"/>
+            <w:vAlign w:val="top"/>
             <w:hideMark/>
           </w:tcPr>
           <w:p>
@@ -125,7 +125,7 @@
           <w:tcPr>
             <w:tcW w:w="0" w:type="auto"/>
             <w:gridSpan w:val="3"/>
-            <w:vAlign w:val="center"/>
+            <w:vAlign w:val="top"/>
             <w:hideMark/>
           </w:tcPr>
           <w:p>
@@ -206,6 +206,9 @@
         <w:tc>
           <w:tcPr>
             <w:tcW w:w="650" w:type="pct"/>
+            <w:tcMar>
+              <w:left w:w="144" w:type="dxa"/>
+            </w:tcMar>
             <w:vAlign w:val="center"/>
             <w:hideMark/>
           </w:tcPr>
@@ -287,6 +290,9 @@
         <w:tc>
           <w:tcPr>
             <w:tcW w:w="0" w:type="auto"/>
+            <w:tcMar>
+              <w:left w:w="144" w:type="dxa"/>
+            </w:tcMar>
             <w:vAlign w:val="center"/>
             <w:hideMark/>
           </w:tcPr>
@@ -368,6 +374,9 @@
         <w:tc>
           <w:tcPr>
             <w:tcW w:w="0" w:type="auto"/>
+            <w:tcMar>
+              <w:left w:w="144" w:type="dxa"/>
+            </w:tcMar>
             <w:vAlign w:val="center"/>
             <w:hideMark/>
           </w:tcPr>

</xml_diff>

<commit_message>
Refine pre-site summary divider
</commit_message>
<xml_diff>
--- a/shared/templates/pre-site-visit/phase-ii-pre-site-visit-v1.docx
+++ b/shared/templates/pre-site-visit/phase-ii-pre-site-visit-v1.docx
@@ -398,7 +398,11 @@
         </w:tc>
       </w:tr>
     </w:tbl>
-    <w:p/>
+    <w:p>
+      <w:pPr>
+        <w:spacing w:before="0" w:after="0" w:line="120" w:lineRule="exact"/>
+      </w:pPr>
+    </w:p>
     <w:tbl>
       <w:tblPr>
         <w:tblW w:w="5000" w:type="pct"/>
@@ -413,23 +417,23 @@
       </w:tblGrid>
       <w:tr>
         <w:trPr>
-          <w:trHeight w:val="20"/>
+          <w:trHeight w:val="40" w:hRule="exact"/>
         </w:trPr>
         <w:tc>
           <w:tcPr>
             <w:tcW w:w="0" w:type="auto"/>
             <w:tcBorders>
-              <w:top w:val="single" w:sz="8" w:space="0" w:color="000000"/>
-              <w:left w:val="single" w:sz="2" w:space="0" w:color="000000"/>
-              <w:bottom w:val="single" w:sz="2" w:space="0" w:color="000000"/>
-              <w:right w:val="single" w:sz="2" w:space="0" w:color="000000"/>
+              <w:top w:val="single" w:sz="16" w:space="0" w:color="000000"/>
+              <w:left w:val="nil"/>
+              <w:bottom w:val="nil"/>
+              <w:right w:val="nil"/>
             </w:tcBorders>
             <w:vAlign w:val="center"/>
             <w:hideMark/>
           </w:tcPr>
           <w:p>
             <w:pPr>
-              <w:spacing w:after="0"/>
+              <w:spacing w:before="0" w:after="0" w:line="20" w:lineRule="exact"/>
               <w:rPr>
                 <w:kern w:val="0"/>
                 <w14:ligatures w14:val="none"/>
@@ -441,6 +445,7 @@
     </w:tbl>
     <w:p>
       <w:pPr>
+        <w:spacing w:before="0" w:after="0" w:line="120" w:lineRule="exact"/>
         <w:rPr>
           <w:b/>
         </w:rPr>

</xml_diff>